<commit_message>
subida documentos para repositorio actualizados
</commit_message>
<xml_diff>
--- a/Fase_2/Evidencias_Proyecto/Evidencia_Documentacion/Documentos_Scrum/Documento de Épicas e Historias de Usuario.docx
+++ b/Fase_2/Evidencias_Proyecto/Evidencia_Documentacion/Documentos_Scrum/Documento de Épicas e Historias de Usuario.docx
@@ -263,7 +263,7 @@
           <w:szCs w:val="48"/>
           <w:rtl w:val="0"/>
         </w:rPr>
-        <w:t xml:space="preserve">HomeCountSimulator</w:t>
+        <w:t xml:space="preserve">HouseCountSimulator</w:t>
       </w:r>
       <w:r>
         <w:rPr>
@@ -800,7 +800,7 @@
     </w:p>
     <w:sdt>
       <w:sdtPr>
-        <w:id w:val="470750809"/>
+        <w:id w:val="2131139219"/>
         <w:docPartObj>
           <w:docPartGallery w:val="Table of Contents"/>
           <w:docPartUnique w:val="1"/>
@@ -941,7 +941,7 @@
               <w:rPr>
                 <w:rtl w:val="0"/>
               </w:rPr>
-              <w:t xml:space="preserve">HomeCount Simulator</w:t>
+              <w:t xml:space="preserve">HouseCount Simulator</w:t>
             </w:r>
           </w:hyperlink>
           <w:hyperlink w:anchor="_heading=h.yd0h9o2wccq">
@@ -1205,6 +1205,8 @@
                 <w:tab w:val="left" w:leader="none" w:pos="1276"/>
               </w:tabs>
               <w:rPr>
+                <w:b w:val="1"/>
+                <w:bCs w:val="1"/>
                 <w:color w:val="000000"/>
                 <w:sz w:val="24"/>
                 <w:szCs w:val="24"/>
@@ -1212,6 +1214,8 @@
             </w:pPr>
             <w:r>
               <w:rPr>
+                <w:b w:val="1"/>
+                <w:bCs w:val="1"/>
                 <w:color w:val="000000"/>
                 <w:sz w:val="24"/>
                 <w:szCs w:val="24"/>
@@ -1229,6 +1233,8 @@
                 <w:tab w:val="left" w:leader="none" w:pos="1276"/>
               </w:tabs>
               <w:rPr>
+                <w:b w:val="1"/>
+                <w:bCs w:val="1"/>
                 <w:color w:val="000000"/>
                 <w:sz w:val="24"/>
                 <w:szCs w:val="24"/>
@@ -1236,6 +1242,8 @@
             </w:pPr>
             <w:r>
               <w:rPr>
+                <w:b w:val="1"/>
+                <w:bCs w:val="1"/>
                 <w:color w:val="000000"/>
                 <w:sz w:val="24"/>
                 <w:szCs w:val="24"/>
@@ -1253,6 +1261,8 @@
                 <w:tab w:val="left" w:leader="none" w:pos="1276"/>
               </w:tabs>
               <w:rPr>
+                <w:b w:val="1"/>
+                <w:bCs w:val="1"/>
                 <w:color w:val="000000"/>
                 <w:sz w:val="24"/>
                 <w:szCs w:val="24"/>
@@ -1260,6 +1270,8 @@
             </w:pPr>
             <w:r>
               <w:rPr>
+                <w:b w:val="1"/>
+                <w:bCs w:val="1"/>
                 <w:color w:val="000000"/>
                 <w:sz w:val="24"/>
                 <w:szCs w:val="24"/>
@@ -1277,6 +1289,8 @@
                 <w:tab w:val="left" w:leader="none" w:pos="1276"/>
               </w:tabs>
               <w:rPr>
+                <w:b w:val="1"/>
+                <w:bCs w:val="1"/>
                 <w:color w:val="000000"/>
                 <w:sz w:val="24"/>
                 <w:szCs w:val="24"/>
@@ -1284,6 +1298,8 @@
             </w:pPr>
             <w:r>
               <w:rPr>
+                <w:b w:val="1"/>
+                <w:bCs w:val="1"/>
                 <w:color w:val="000000"/>
                 <w:sz w:val="24"/>
                 <w:szCs w:val="24"/>
@@ -1551,6 +1567,14 @@
             </w:pPr>
             <w:r>
               <w:rPr>
+                <w:sz w:val="24"/>
+                <w:szCs w:val="24"/>
+                <w:rtl w:val="0"/>
+              </w:rPr>
+              <w:t xml:space="preserve">0.3 </w:t>
+            </w:r>
+            <w:r>
+              <w:rPr>
                 <w:rtl w:val="0"/>
               </w:rPr>
             </w:r>
@@ -1571,6 +1595,14 @@
             </w:pPr>
             <w:r>
               <w:rPr>
+                <w:sz w:val="24"/>
+                <w:szCs w:val="24"/>
+                <w:rtl w:val="0"/>
+              </w:rPr>
+              <w:t xml:space="preserve">14/09/2026</w:t>
+            </w:r>
+            <w:r>
+              <w:rPr>
                 <w:rtl w:val="0"/>
               </w:rPr>
             </w:r>
@@ -1591,6 +1623,14 @@
             </w:pPr>
             <w:r>
               <w:rPr>
+                <w:sz w:val="24"/>
+                <w:szCs w:val="24"/>
+                <w:rtl w:val="0"/>
+              </w:rPr>
+              <w:t xml:space="preserve">Agregado 2 historias de usuario </w:t>
+            </w:r>
+            <w:r>
+              <w:rPr>
                 <w:rtl w:val="0"/>
               </w:rPr>
             </w:r>
@@ -1609,6 +1649,14 @@
                 <w:szCs w:val="24"/>
               </w:rPr>
             </w:pPr>
+            <w:r>
+              <w:rPr>
+                <w:sz w:val="24"/>
+                <w:szCs w:val="24"/>
+                <w:rtl w:val="0"/>
+              </w:rPr>
+              <w:t xml:space="preserve">Benjamín Núñez</w:t>
+            </w:r>
             <w:r>
               <w:rPr>
                 <w:rtl w:val="0"/>
@@ -1820,7 +1868,7 @@
               <w:rPr>
                 <w:rtl w:val="0"/>
               </w:rPr>
-              <w:t xml:space="preserve">HomeCount_Simulator</w:t>
+              <w:t xml:space="preserve">HouseCount_Simulator</w:t>
             </w:r>
             <w:r>
               <w:rPr>
@@ -2526,7 +2574,7 @@
         <w:rPr>
           <w:rtl w:val="0"/>
         </w:rPr>
-        <w:t xml:space="preserve">Épicas para el proyecto HomeCount Simulator</w:t>
+        <w:t xml:space="preserve">Épicas para el proyecto HouseCount Simulator</w:t>
       </w:r>
     </w:p>
     <w:p>
@@ -2649,7 +2697,7 @@
               <w:rPr>
                 <w:rtl w:val="0"/>
               </w:rPr>
-              <w:t xml:space="preserve">Como usuario de HouseCount, necesito definir un presupuesto y obtener cotizaciones de vivienda ajustadas a ese monto, con la finalidad de tomar decisiones de construcción sin exceder mi capacidad financiera.</w:t>
+              <w:t xml:space="preserve">Como usuario de HouseCount, necesito definir un presupuesto y obtener cotizaciones de vivienda ajustadas a ese monto, con la finalidad de tomar decisiones de construcción sin exceder la capacidad financiera.</w:t>
             </w:r>
           </w:p>
         </w:tc>
@@ -2912,12 +2960,12 @@
                 <wp:inline distB="114300" distT="114300" distL="114300" distR="114300">
                   <wp:extent cx="2191703" cy="1727721"/>
                   <wp:effectExtent b="0" l="0" r="0" t="0"/>
-                  <wp:docPr id="6" name="image4.png"/>
+                  <wp:docPr id="8" name="image1.png"/>
                   <a:graphic>
                     <a:graphicData uri="http://schemas.openxmlformats.org/drawingml/2006/picture">
                       <pic:pic>
                         <pic:nvPicPr>
-                          <pic:cNvPr id="0" name="image4.png"/>
+                          <pic:cNvPr id="0" name="image1.png"/>
                           <pic:cNvPicPr preferRelativeResize="0"/>
                         </pic:nvPicPr>
                         <pic:blipFill>
@@ -3395,12 +3443,12 @@
           <wp:inline distB="114300" distT="114300" distL="114300" distR="114300">
             <wp:extent cx="5612130" cy="622300"/>
             <wp:effectExtent b="12700" l="12700" r="12700" t="12700"/>
-            <wp:docPr id="7" name="image5.png"/>
+            <wp:docPr id="9" name="image4.png"/>
             <a:graphic>
               <a:graphicData uri="http://schemas.openxmlformats.org/drawingml/2006/picture">
                 <pic:pic>
                   <pic:nvPicPr>
-                    <pic:cNvPr id="0" name="image5.png"/>
+                    <pic:cNvPr id="0" name="image4.png"/>
                     <pic:cNvPicPr preferRelativeResize="0"/>
                   </pic:nvPicPr>
                   <pic:blipFill>
@@ -3467,7 +3515,7 @@
           <wp:inline distB="114300" distT="114300" distL="114300" distR="114300">
             <wp:extent cx="5612130" cy="609600"/>
             <wp:effectExtent b="12700" l="12700" r="12700" t="12700"/>
-            <wp:docPr id="5" name="image2.png"/>
+            <wp:docPr id="6" name="image2.png"/>
             <a:graphic>
               <a:graphicData uri="http://schemas.openxmlformats.org/drawingml/2006/picture">
                 <pic:pic>
@@ -3539,12 +3587,12 @@
           <wp:inline distB="114300" distT="114300" distL="114300" distR="114300">
             <wp:extent cx="5612130" cy="419100"/>
             <wp:effectExtent b="12700" l="12700" r="12700" t="12700"/>
-            <wp:docPr id="9" name="image3.png"/>
+            <wp:docPr id="11" name="image6.png"/>
             <a:graphic>
               <a:graphicData uri="http://schemas.openxmlformats.org/drawingml/2006/picture">
                 <pic:pic>
                   <pic:nvPicPr>
-                    <pic:cNvPr id="0" name="image3.png"/>
+                    <pic:cNvPr id="0" name="image6.png"/>
                     <pic:cNvPicPr preferRelativeResize="0"/>
                   </pic:nvPicPr>
                   <pic:blipFill>
@@ -3611,12 +3659,12 @@
           <wp:inline distB="114300" distT="114300" distL="114300" distR="114300">
             <wp:extent cx="5612130" cy="457200"/>
             <wp:effectExtent b="12700" l="12700" r="12700" t="12700"/>
-            <wp:docPr id="8" name="image6.png"/>
+            <wp:docPr id="10" name="image5.png"/>
             <a:graphic>
               <a:graphicData uri="http://schemas.openxmlformats.org/drawingml/2006/picture">
                 <pic:pic>
                   <pic:nvPicPr>
-                    <pic:cNvPr id="0" name="image6.png"/>
+                    <pic:cNvPr id="0" name="image5.png"/>
                     <pic:cNvPicPr preferRelativeResize="0"/>
                   </pic:nvPicPr>
                   <pic:blipFill>
@@ -3657,24 +3705,63 @@
       </w:pPr>
       <w:r>
         <w:rPr>
-          <w:rtl w:val="0"/>
-        </w:rPr>
-      </w:r>
-    </w:p>
-    <w:p>
-      <w:pPr>
+          <w:b w:val="1"/>
+          <w:bCs w:val="1"/>
+          <w:rtl w:val="0"/>
+        </w:rPr>
+        <w:t xml:space="preserve">Historia 5. HCS-005</w:t>
+      </w:r>
+      <w:r>
+        <w:rPr>
+          <w:rtl w:val="0"/>
+        </w:rPr>
+      </w:r>
+    </w:p>
+    <w:p>
+      <w:pPr>
+        <w:ind w:left="0" w:firstLine="0"/>
         <w:rPr/>
       </w:pPr>
       <w:r>
-        <w:rPr>
-          <w:rtl w:val="0"/>
-        </w:rPr>
-      </w:r>
-    </w:p>
-    <w:p>
-      <w:pPr>
         <w:rPr/>
-      </w:pPr>
+        <w:drawing>
+          <wp:inline distB="114300" distT="114300" distL="114300" distR="114300">
+            <wp:extent cx="5612130" cy="622300"/>
+            <wp:effectExtent b="12700" l="12700" r="12700" t="12700"/>
+            <wp:docPr id="5" name="image8.png"/>
+            <a:graphic>
+              <a:graphicData uri="http://schemas.openxmlformats.org/drawingml/2006/picture">
+                <pic:pic>
+                  <pic:nvPicPr>
+                    <pic:cNvPr id="0" name="image8.png"/>
+                    <pic:cNvPicPr preferRelativeResize="0"/>
+                  </pic:nvPicPr>
+                  <pic:blipFill>
+                    <a:blip r:embed="rId12"/>
+                    <a:srcRect b="0" l="0" r="0" t="0"/>
+                    <a:stretch>
+                      <a:fillRect/>
+                    </a:stretch>
+                  </pic:blipFill>
+                  <pic:spPr>
+                    <a:xfrm>
+                      <a:off x="0" y="0"/>
+                      <a:ext cx="5612130" cy="622300"/>
+                    </a:xfrm>
+                    <a:prstGeom prst="rect"/>
+                    <a:ln w="12700">
+                      <a:solidFill>
+                        <a:srgbClr val="000000"/>
+                      </a:solidFill>
+                      <a:prstDash val="solid"/>
+                    </a:ln>
+                  </pic:spPr>
+                </pic:pic>
+              </a:graphicData>
+            </a:graphic>
+          </wp:inline>
+        </w:drawing>
+      </w:r>
       <w:r>
         <w:rPr>
           <w:rtl w:val="0"/>
@@ -3687,13 +3774,81 @@
       </w:pPr>
       <w:r>
         <w:rPr>
+          <w:b w:val="1"/>
+          <w:bCs w:val="1"/>
+          <w:rtl w:val="0"/>
+        </w:rPr>
+        <w:t xml:space="preserve">Historia 6. HCS-006</w:t>
+      </w:r>
+      <w:r>
+        <w:rPr>
+          <w:rtl w:val="0"/>
+        </w:rPr>
+      </w:r>
+    </w:p>
+    <w:p>
+      <w:pPr>
+        <w:rPr/>
+      </w:pPr>
+      <w:r>
+        <w:rPr/>
+        <w:drawing>
+          <wp:inline distB="114300" distT="114300" distL="114300" distR="114300">
+            <wp:extent cx="5612130" cy="495300"/>
+            <wp:effectExtent b="12700" l="12700" r="12700" t="12700"/>
+            <wp:docPr id="7" name="image3.png"/>
+            <a:graphic>
+              <a:graphicData uri="http://schemas.openxmlformats.org/drawingml/2006/picture">
+                <pic:pic>
+                  <pic:nvPicPr>
+                    <pic:cNvPr id="0" name="image3.png"/>
+                    <pic:cNvPicPr preferRelativeResize="0"/>
+                  </pic:nvPicPr>
+                  <pic:blipFill>
+                    <a:blip r:embed="rId13"/>
+                    <a:srcRect b="0" l="0" r="0" t="0"/>
+                    <a:stretch>
+                      <a:fillRect/>
+                    </a:stretch>
+                  </pic:blipFill>
+                  <pic:spPr>
+                    <a:xfrm>
+                      <a:off x="0" y="0"/>
+                      <a:ext cx="5612130" cy="495300"/>
+                    </a:xfrm>
+                    <a:prstGeom prst="rect"/>
+                    <a:ln w="12700">
+                      <a:solidFill>
+                        <a:srgbClr val="000000"/>
+                      </a:solidFill>
+                      <a:prstDash val="solid"/>
+                    </a:ln>
+                  </pic:spPr>
+                </pic:pic>
+              </a:graphicData>
+            </a:graphic>
+          </wp:inline>
+        </w:drawing>
+      </w:r>
+      <w:r>
+        <w:rPr>
+          <w:rtl w:val="0"/>
+        </w:rPr>
+      </w:r>
+    </w:p>
+    <w:p>
+      <w:pPr>
+        <w:rPr/>
+      </w:pPr>
+      <w:r>
+        <w:rPr>
           <w:rtl w:val="0"/>
         </w:rPr>
       </w:r>
     </w:p>
     <w:sectPr>
-      <w:headerReference r:id="rId12" w:type="default"/>
-      <w:footerReference r:id="rId13" w:type="default"/>
+      <w:headerReference r:id="rId14" w:type="default"/>
+      <w:footerReference r:id="rId15" w:type="default"/>
       <w:pgSz w:h="15840" w:w="12240" w:orient="portrait"/>
       <w:pgMar w:bottom="1418" w:top="1418" w:left="1701" w:right="1701" w:header="709" w:footer="709"/>
       <w:pgNumType w:start="1"/>
@@ -3881,12 +4036,12 @@
           <wp:extent cx="932815" cy="231775"/>
           <wp:effectExtent b="0" l="0" r="0" t="0"/>
           <wp:wrapSquare wrapText="bothSides" distB="0" distT="0" distL="114300" distR="114300"/>
-          <wp:docPr id="4" name="image1.png"/>
+          <wp:docPr id="4" name="image7.png"/>
           <a:graphic>
             <a:graphicData uri="http://schemas.openxmlformats.org/drawingml/2006/picture">
               <pic:pic>
                 <pic:nvPicPr>
-                  <pic:cNvPr id="0" name="image1.png"/>
+                  <pic:cNvPr id="0" name="image7.png"/>
                   <pic:cNvPicPr preferRelativeResize="0"/>
                 </pic:nvPicPr>
                 <pic:blipFill>

</xml_diff>